<commit_message>
Complete 2026-27 course migration updates
</commit_message>
<xml_diff>
--- a/0_SYLLABUS/Syllabus_G351_QuantitativeMethodsForHumanities_2026-27.docx
+++ b/0_SYLLABUS/Syllabus_G351_QuantitativeMethodsForHumanities_2026-27.docx
@@ -150,7 +150,7 @@
                 <w:szCs w:val="24"/>
                 <w:shd w:val="clear" w:color="auto" w:fill="FFFFFF"/>
               </w:rPr>
-              <w:t>Quantitative Methods for Humanities</w:t>
+              <w:t>Quantitative</w:t>
             </w:r>
             <w:proofErr w:type="spellEnd"/>
             <w:r>
@@ -161,8 +161,7 @@
                 <w:szCs w:val="24"/>
                 <w:shd w:val="clear" w:color="auto" w:fill="FFFFFF"/>
               </w:rPr>
-              <w:t xml:space="preserve">
-              </w:t>
+              <w:t xml:space="preserve"> </w:t>
             </w:r>
             <w:proofErr w:type="spellStart"/>
             <w:r>
@@ -173,8 +172,7 @@
                 <w:szCs w:val="24"/>
                 <w:shd w:val="clear" w:color="auto" w:fill="FFFFFF"/>
               </w:rPr>
-              <w:t>
-              </w:t>
+              <w:t>Methods</w:t>
             </w:r>
             <w:proofErr w:type="spellEnd"/>
             <w:r>
@@ -185,8 +183,7 @@
                 <w:szCs w:val="24"/>
                 <w:shd w:val="clear" w:color="auto" w:fill="FFFFFF"/>
               </w:rPr>
-              <w:t xml:space="preserve">
-              </w:t>
+              <w:t xml:space="preserve"> </w:t>
             </w:r>
             <w:proofErr w:type="spellStart"/>
             <w:r>
@@ -197,8 +194,7 @@
                 <w:szCs w:val="24"/>
                 <w:shd w:val="clear" w:color="auto" w:fill="FFFFFF"/>
               </w:rPr>
-              <w:t>
-              </w:t>
+              <w:t>for</w:t>
             </w:r>
             <w:proofErr w:type="spellEnd"/>
             <w:r>
@@ -209,8 +205,7 @@
                 <w:szCs w:val="24"/>
                 <w:shd w:val="clear" w:color="auto" w:fill="FFFFFF"/>
               </w:rPr>
-              <w:t xml:space="preserve">
-              </w:t>
+              <w:t xml:space="preserve"> </w:t>
             </w:r>
             <w:proofErr w:type="spellStart"/>
             <w:r>
@@ -221,10 +216,19 @@
                 <w:szCs w:val="24"/>
                 <w:shd w:val="clear" w:color="auto" w:fill="FFFFFF"/>
               </w:rPr>
-              <w:t>
-              </w:t>
+              <w:t>Humanities</w:t>
             </w:r>
             <w:proofErr w:type="spellEnd"/>
+            <w:r>
+              <w:rPr>
+                <w:rFonts w:cstheme="minorHAnsi"/>
+                <w:color w:val="000000"/>
+                <w:sz w:val="24"/>
+                <w:szCs w:val="24"/>
+                <w:shd w:val="clear" w:color="auto" w:fill="FFFFFF"/>
+              </w:rPr>
+              <w:t xml:space="preserve">                                             </w:t>
+            </w:r>
           </w:p>
         </w:tc>
         <w:tc>
@@ -721,29 +725,16 @@
                 <w:sz w:val="24"/>
                 <w:szCs w:val="24"/>
               </w:rPr>
-              <w:t xml:space="preserve">
-              </w:t>
-            </w:r>
-            <w:hyperlink r:id="rId10" w:history="1">
-              <w:r>
-                <w:rPr>
-                  <w:rStyle w:val="Hyperlink"/>
-                  <w:rFonts w:cstheme="minorHAnsi"/>
-                  <w:sz w:val="24"/>
-                  <w:szCs w:val="24"/>
-                </w:rPr>
-                <w:t>
-                </w:t>
-              </w:r>
-            </w:hyperlink>
+              <w:t xml:space="preserve">               </w:t>
+            </w:r>
+            <w:hyperlink r:id="rId10" w:history="1"/>
             <w:r>
               <w:rPr>
                 <w:rFonts w:cstheme="minorHAnsi"/>
                 <w:sz w:val="24"/>
                 <w:szCs w:val="24"/>
               </w:rPr>
-              <w:t xml:space="preserve">
-              </w:t>
+              <w:t xml:space="preserve">               </w:t>
             </w:r>
           </w:p>
         </w:tc>
@@ -1134,29 +1125,7 @@
           <w:szCs w:val="20"/>
           <w:lang w:val="en-GB"/>
         </w:rPr>
-        <w:t xml:space="preserve">Module 0 (Optional enrichment). Introduction to R</w:t>
-      </w:r>
-      <w:r>
-        <w:rPr>
-          <w:rFonts w:cstheme="minorHAnsi"/>
-          <w:b/>
-          <w:sz w:val="20"/>
-          <w:szCs w:val="20"/>
-          <w:lang w:val="en-GB"/>
-        </w:rPr>
-        <w:t>
-        </w:t>
-      </w:r>
-      <w:r>
-        <w:rPr>
-          <w:rFonts w:cstheme="minorHAnsi"/>
-          <w:b/>
-          <w:sz w:val="20"/>
-          <w:szCs w:val="20"/>
-          <w:lang w:val="en-GB"/>
-        </w:rPr>
-        <w:t>
-        </w:t>
+        <w:t>Module 0 (Optional enrichment). Introduction to R</w:t>
       </w:r>
     </w:p>
     <w:p>
@@ -1460,8 +1429,7 @@
           <w:szCs w:val="20"/>
           <w:lang w:val="en-GB"/>
         </w:rPr>
-        <w:t xml:space="preserve">
-        </w:t>
+        <w:t xml:space="preserve">                  </w:t>
       </w:r>
       <w:r>
         <w:rPr>
@@ -1471,52 +1439,7 @@
           <w:szCs w:val="20"/>
           <w:lang w:val="en-GB"/>
         </w:rPr>
-        <w:t>
-        </w:t>
-      </w:r>
-      <w:r>
-        <w:rPr>
-          <w:rFonts w:cstheme="minorHAnsi"/>
-          <w:b/>
-          <w:sz w:val="20"/>
-          <w:szCs w:val="20"/>
-          <w:lang w:val="en-GB"/>
-        </w:rPr>
-        <w:t xml:space="preserve">
-        </w:t>
-      </w:r>
-      <w:r>
-        <w:rPr>
-          <w:rFonts w:cstheme="minorHAnsi"/>
-          <w:b/>
-          <w:sz w:val="20"/>
-          <w:szCs w:val="20"/>
-          <w:lang w:val="en-GB"/>
-        </w:rPr>
-        <w:t xml:space="preserve">
-        </w:t>
-      </w:r>
-      <w:r>
-        <w:rPr>
-          <w:rFonts w:cstheme="minorHAnsi"/>
-          <w:b/>
-          <w:sz w:val="20"/>
-          <w:szCs w:val="20"/>
-          <w:lang w:val="en-GB"/>
-        </w:rPr>
-        <w:t>
-        </w:t>
-      </w:r>
-      <w:r>
-        <w:rPr>
-          <w:rFonts w:cstheme="minorHAnsi"/>
-          <w:b/>
-          <w:sz w:val="20"/>
-          <w:szCs w:val="20"/>
-          <w:lang w:val="en-GB"/>
-        </w:rPr>
-        <w:t>
-        </w:t>
+        <w:t xml:space="preserve">         </w:t>
       </w:r>
     </w:p>
     <w:p>
@@ -1758,7 +1681,7 @@
           <w:szCs w:val="20"/>
           <w:lang w:val="en-GB"/>
         </w:rPr>
-        <w:t xml:space="preserve">Module 2. Causality and the Potential Outcomes Framework</w:t>
+        <w:t xml:space="preserve">Module 2. Causality and the Potential Outcomes Framework         </w:t>
       </w:r>
       <w:r>
         <w:rPr>
@@ -1768,8 +1691,7 @@
           <w:szCs w:val="20"/>
           <w:lang w:val="en-GB"/>
         </w:rPr>
-        <w:t>
-        </w:t>
+        <w:t xml:space="preserve">         </w:t>
       </w:r>
       <w:r>
         <w:rPr>
@@ -1779,52 +1701,7 @@
           <w:szCs w:val="20"/>
           <w:lang w:val="en-GB"/>
         </w:rPr>
-        <w:t xml:space="preserve">
-        </w:t>
-      </w:r>
-      <w:r>
-        <w:rPr>
-          <w:rFonts w:cstheme="minorHAnsi"/>
-          <w:b/>
-          <w:sz w:val="20"/>
-          <w:szCs w:val="20"/>
-          <w:lang w:val="en-GB"/>
-        </w:rPr>
-        <w:t>
-        </w:t>
-      </w:r>
-      <w:r>
-        <w:rPr>
-          <w:rFonts w:cstheme="minorHAnsi"/>
-          <w:b/>
-          <w:sz w:val="20"/>
-          <w:szCs w:val="20"/>
-          <w:lang w:val="en-GB"/>
-        </w:rPr>
-        <w:t xml:space="preserve">
-        </w:t>
-      </w:r>
-      <w:r>
-        <w:rPr>
-          <w:rFonts w:cstheme="minorHAnsi"/>
-          <w:b/>
-          <w:sz w:val="20"/>
-          <w:szCs w:val="20"/>
-          <w:lang w:val="en-GB"/>
-        </w:rPr>
-        <w:t xml:space="preserve">
-        </w:t>
-      </w:r>
-      <w:r>
-        <w:rPr>
-          <w:rFonts w:cstheme="minorHAnsi"/>
-          <w:b/>
-          <w:sz w:val="20"/>
-          <w:szCs w:val="20"/>
-          <w:lang w:val="en-GB"/>
-        </w:rPr>
-        <w:t>
-        </w:t>
+        <w:t xml:space="preserve">         </w:t>
       </w:r>
     </w:p>
     <w:p>
@@ -2017,40 +1894,7 @@
           <w:szCs w:val="20"/>
           <w:lang w:val="en-GB"/>
         </w:rPr>
-        <w:t xml:space="preserve">Module 3. Studies</w:t>
-      </w:r>
-      <w:r>
-        <w:rPr>
-          <w:rFonts w:cstheme="minorHAnsi"/>
-          <w:b/>
-          <w:sz w:val="20"/>
-          <w:szCs w:val="20"/>
-          <w:lang w:val="en-GB"/>
-        </w:rPr>
-        <w:t>
-        </w:t>
-      </w:r>
-      <w:r>
-        <w:rPr>
-          <w:rFonts w:cstheme="minorHAnsi"/>
-          <w:b/>
-          <w:sz w:val="20"/>
-          <w:szCs w:val="20"/>
-          <w:lang w:val="en-GB"/>
-        </w:rPr>
-        <w:t xml:space="preserve">
-        </w:t>
-      </w:r>
-      <w:r>
-        <w:rPr>
-          <w:rFonts w:cstheme="minorHAnsi"/>
-          <w:b/>
-          <w:sz w:val="20"/>
-          <w:szCs w:val="20"/>
-          <w:lang w:val="en-GB"/>
-        </w:rPr>
-        <w:t>
-        </w:t>
+        <w:t xml:space="preserve">Module 3. Studies         </w:t>
       </w:r>
     </w:p>
     <w:p>
@@ -2252,7 +2096,7 @@
           <w:sz w:val="20"/>
           <w:szCs w:val="20"/>
         </w:rPr>
-        <w:t>Internal and external validity.</w:t>
+        <w:t>Internal</w:t>
       </w:r>
       <w:proofErr w:type="spellEnd"/>
       <w:r>
@@ -2260,8 +2104,7 @@
           <w:sz w:val="20"/>
           <w:szCs w:val="20"/>
         </w:rPr>
-        <w:t xml:space="preserve">
-        </w:t>
+        <w:t xml:space="preserve"> and </w:t>
       </w:r>
       <w:proofErr w:type="spellStart"/>
       <w:r>
@@ -2269,8 +2112,7 @@
           <w:sz w:val="20"/>
           <w:szCs w:val="20"/>
         </w:rPr>
-        <w:t>
-        </w:t>
+        <w:t>external</w:t>
       </w:r>
       <w:proofErr w:type="spellEnd"/>
       <w:r>
@@ -2278,8 +2120,7 @@
           <w:sz w:val="20"/>
           <w:szCs w:val="20"/>
         </w:rPr>
-        <w:t xml:space="preserve">
-        </w:t>
+        <w:t xml:space="preserve"> </w:t>
       </w:r>
       <w:proofErr w:type="spellStart"/>
       <w:r>
@@ -2287,8 +2128,7 @@
           <w:sz w:val="20"/>
           <w:szCs w:val="20"/>
         </w:rPr>
-        <w:t>
-        </w:t>
+        <w:t>validity</w:t>
       </w:r>
       <w:proofErr w:type="spellEnd"/>
       <w:r>
@@ -2296,8 +2136,7 @@
           <w:sz w:val="20"/>
           <w:szCs w:val="20"/>
         </w:rPr>
-        <w:t>
-        </w:t>
+        <w:t xml:space="preserve">.                  </w:t>
       </w:r>
     </w:p>
     <w:p>
@@ -2333,40 +2172,7 @@
           <w:szCs w:val="20"/>
           <w:lang w:val="en-GB"/>
         </w:rPr>
-        <w:t xml:space="preserve">Module 4. The Linear Regression Model</w:t>
-      </w:r>
-      <w:r>
-        <w:rPr>
-          <w:rFonts w:cstheme="minorHAnsi"/>
-          <w:b/>
-          <w:sz w:val="20"/>
-          <w:szCs w:val="20"/>
-          <w:lang w:val="en-GB"/>
-        </w:rPr>
-        <w:t>
-        </w:t>
-      </w:r>
-      <w:r>
-        <w:rPr>
-          <w:rFonts w:cstheme="minorHAnsi"/>
-          <w:b/>
-          <w:sz w:val="20"/>
-          <w:szCs w:val="20"/>
-          <w:lang w:val="en-GB"/>
-        </w:rPr>
-        <w:t xml:space="preserve">
-        </w:t>
-      </w:r>
-      <w:r>
-        <w:rPr>
-          <w:rFonts w:cstheme="minorHAnsi"/>
-          <w:b/>
-          <w:sz w:val="20"/>
-          <w:szCs w:val="20"/>
-          <w:lang w:val="en-GB"/>
-        </w:rPr>
-        <w:t>
-        </w:t>
+        <w:t xml:space="preserve">Module 4. The Linear Regression Model         </w:t>
       </w:r>
     </w:p>
     <w:p>
@@ -2495,8 +2301,7 @@
           <w:szCs w:val="20"/>
           <w:lang w:val="en-GB"/>
         </w:rPr>
-        <w:t xml:space="preserve">
-        </w:t>
+        <w:t xml:space="preserve">         </w:t>
       </w:r>
     </w:p>
     <w:p>
@@ -2664,79 +2469,7 @@
           <w:szCs w:val="20"/>
           <w:lang w:val="en-GB"/>
         </w:rPr>
-        <w:t>The LRM and quasi-experimental methods. Control variables and instrumental variables. The Regression-Discontinuity design.</w:t>
-      </w:r>
-      <w:r>
-        <w:rPr>
-          <w:sz w:val="20"/>
-          <w:szCs w:val="20"/>
-          <w:lang w:val="en-GB"/>
-        </w:rPr>
-        <w:t>
-        </w:t>
-      </w:r>
-      <w:r>
-        <w:rPr>
-          <w:sz w:val="20"/>
-          <w:szCs w:val="20"/>
-          <w:lang w:val="en-GB"/>
-        </w:rPr>
-        <w:t xml:space="preserve">
-        </w:t>
-      </w:r>
-      <w:r>
-        <w:rPr>
-          <w:sz w:val="20"/>
-          <w:szCs w:val="20"/>
-          <w:lang w:val="en-GB"/>
-        </w:rPr>
-        <w:t>
-        </w:t>
-      </w:r>
-      <w:r>
-        <w:rPr>
-          <w:sz w:val="20"/>
-          <w:szCs w:val="20"/>
-          <w:lang w:val="en-GB"/>
-        </w:rPr>
-        <w:t xml:space="preserve">
-        </w:t>
-      </w:r>
-      <w:r>
-        <w:rPr>
-          <w:sz w:val="20"/>
-          <w:szCs w:val="20"/>
-          <w:lang w:val="en-GB"/>
-        </w:rPr>
-        <w:t>
-        </w:t>
-      </w:r>
-      <w:r>
-        <w:rPr>
-          <w:sz w:val="20"/>
-          <w:szCs w:val="20"/>
-          <w:lang w:val="en-GB"/>
-        </w:rPr>
-        <w:t>
-        </w:t>
-      </w:r>
-      <w:r>
-        <w:rPr>
-          <w:sz w:val="20"/>
-          <w:szCs w:val="20"/>
-          <w:lang w:val="en-GB"/>
-        </w:rPr>
-        <w:t>
-        </w:t>
-      </w:r>
-      <w:r>
-        <w:rPr>
-          <w:sz w:val="20"/>
-          <w:szCs w:val="20"/>
-          <w:lang w:val="en-GB"/>
-        </w:rPr>
-        <w:t xml:space="preserve">
-        </w:t>
+        <w:t xml:space="preserve">The LRM and quasi-experimental methods. Control variables and instrumental variables. The Regression-Discontinuity design.                           </w:t>
       </w:r>
     </w:p>
     <w:p>
@@ -2850,40 +2583,7 @@
           <w:szCs w:val="20"/>
           <w:lang w:val="en-GB"/>
         </w:rPr>
-        <w:t xml:space="preserve">Module 5. Qualitative Methods</w:t>
-      </w:r>
-      <w:r>
-        <w:rPr>
-          <w:rFonts w:cstheme="minorHAnsi"/>
-          <w:b/>
-          <w:sz w:val="20"/>
-          <w:szCs w:val="20"/>
-          <w:lang w:val="en-GB"/>
-        </w:rPr>
-        <w:t>
-        </w:t>
-      </w:r>
-      <w:r>
-        <w:rPr>
-          <w:rFonts w:cstheme="minorHAnsi"/>
-          <w:b/>
-          <w:sz w:val="20"/>
-          <w:szCs w:val="20"/>
-          <w:lang w:val="en-GB"/>
-        </w:rPr>
-        <w:t>
-        </w:t>
-      </w:r>
-      <w:r>
-        <w:rPr>
-          <w:rFonts w:cstheme="minorHAnsi"/>
-          <w:b/>
-          <w:sz w:val="20"/>
-          <w:szCs w:val="20"/>
-          <w:lang w:val="en-GB"/>
-        </w:rPr>
-        <w:t>
-        </w:t>
+        <w:t>Module 5. Qualitative Methods</w:t>
       </w:r>
     </w:p>
     <w:p>
@@ -3044,51 +2744,7 @@
           <w:szCs w:val="20"/>
           <w:lang w:val="en-US"/>
         </w:rPr>
-        <w:t xml:space="preserve">A continuous assessment process will take place during the course based on short quizzes, two midterm exams, a paper-analysis group project, and a final exam. The continuous evaluation will weigh 40% of the final mark, and the remaining 60% will come from the final exam. The minimum mark required in the final exam to succeed is 5: if this score is not achieved then the final mark will be the one obtained in the final exam.</w:t>
-      </w:r>
-      <w:proofErr w:type="gramStart"/>
-      <w:r>
-        <w:rPr>
-          <w:rFonts w:cstheme="minorHAnsi"/>
-          <w:sz w:val="20"/>
-          <w:szCs w:val="20"/>
-          <w:lang w:val="en-US"/>
-        </w:rPr>
-        <w:t>
-        </w:t>
-      </w:r>
-      <w:proofErr w:type="gramEnd"/>
-      <w:r>
-        <w:rPr>
-          <w:rFonts w:cstheme="minorHAnsi"/>
-          <w:sz w:val="20"/>
-          <w:szCs w:val="20"/>
-          <w:lang w:val="en-US"/>
-        </w:rPr>
-        <w:t xml:space="preserve">
-        </w:t>
-      </w:r>
-      <w:proofErr w:type="gramStart"/>
-      <w:r>
-        <w:rPr>
-          <w:rFonts w:cstheme="minorHAnsi"/>
-          <w:sz w:val="20"/>
-          <w:szCs w:val="20"/>
-          <w:lang w:val="en-US"/>
-        </w:rPr>
-        <w:t>
-        </w:t>
-      </w:r>
-      <w:proofErr w:type="gramEnd"/>
-      <w:r>
-        <w:rPr>
-          <w:rFonts w:cstheme="minorHAnsi"/>
-          <w:sz w:val="20"/>
-          <w:szCs w:val="20"/>
-          <w:lang w:val="en-US"/>
-        </w:rPr>
-        <w:t xml:space="preserve">
-        </w:t>
+        <w:t xml:space="preserve">A continuous assessment process will take place during the course based on short quizzes, two midterm exams, a paper-analysis group project, and a final exam. The continuous evaluation will weigh 40% of the final mark, and the remaining 60% will come from the final exam. The minimum mark required in the final exam to succeed is 5: if this score is not achieved then the final mark will be the one obtained in the final exam.                  </w:t>
       </w:r>
     </w:p>
     <w:p>
@@ -3497,25 +3153,7 @@
                 <w:szCs w:val="20"/>
                 <w:lang w:val="en-GB"/>
               </w:rPr>
-              <w:t xml:space="preserve">Quizzes and short checks on course content.</w:t>
-            </w:r>
-            <w:r>
-              <w:rPr>
-                <w:sz w:val="20"/>
-                <w:szCs w:val="20"/>
-                <w:lang w:val="en-GB"/>
-              </w:rPr>
-              <w:t>
-              </w:t>
-            </w:r>
-            <w:r>
-              <w:rPr>
-                <w:sz w:val="20"/>
-                <w:szCs w:val="20"/>
-                <w:lang w:val="en-GB"/>
-              </w:rPr>
-              <w:t>
-              </w:t>
+              <w:t>Quizzes and short checks on course content.</w:t>
             </w:r>
           </w:p>
         </w:tc>
@@ -3696,8 +3334,7 @@
                 <w:szCs w:val="20"/>
                 <w:lang w:val="en-GB"/>
               </w:rPr>
-              <w:t xml:space="preserve">
-              </w:t>
+              <w:t xml:space="preserve">               </w:t>
             </w:r>
             <w:r>
               <w:rPr>
@@ -3705,17 +3342,7 @@
                 <w:szCs w:val="20"/>
                 <w:lang w:val="en-GB"/>
               </w:rPr>
-              <w:t xml:space="preserve">
-              </w:t>
-            </w:r>
-            <w:r>
-              <w:rPr>
-                <w:sz w:val="20"/>
-                <w:szCs w:val="20"/>
-                <w:lang w:val="en-GB"/>
-              </w:rPr>
-              <w:t>
-              </w:t>
+              <w:t xml:space="preserve">               </w:t>
             </w:r>
           </w:p>
         </w:tc>
@@ -3897,7 +3524,7 @@
                 <w:szCs w:val="20"/>
                 <w:lang w:val="en-GB"/>
               </w:rPr>
-              <w:t xml:space="preserve">Group project applying course concepts to analyse a published paper on causal inference. Submission and oral presentation by a deadline.</w:t>
+              <w:t>Group project applying course concepts to analyse a published paper on causal inference. Submission and oral presentation by a deadline.</w:t>
             </w:r>
             <w:r>
               <w:rPr>
@@ -3905,8 +3532,7 @@
                 <w:szCs w:val="20"/>
                 <w:lang w:val="en-GB"/>
               </w:rPr>
-              <w:t>
-              </w:t>
+              <w:t xml:space="preserve">               </w:t>
             </w:r>
             <w:r>
               <w:rPr>
@@ -3914,8 +3540,7 @@
                 <w:szCs w:val="20"/>
                 <w:lang w:val="en-GB"/>
               </w:rPr>
-              <w:t>
-              </w:t>
+              <w:t xml:space="preserve">                              </w:t>
             </w:r>
             <w:r>
               <w:rPr>
@@ -3923,8 +3548,7 @@
                 <w:szCs w:val="20"/>
                 <w:lang w:val="en-GB"/>
               </w:rPr>
-              <w:t>
-              </w:t>
+              <w:t xml:space="preserve">               </w:t>
             </w:r>
             <w:r>
               <w:rPr>
@@ -3932,62 +3556,7 @@
                 <w:szCs w:val="20"/>
                 <w:lang w:val="en-GB"/>
               </w:rPr>
-              <w:t xml:space="preserve">
-              </w:t>
-            </w:r>
-            <w:r>
-              <w:rPr>
-                <w:sz w:val="20"/>
-                <w:szCs w:val="20"/>
-                <w:lang w:val="en-GB"/>
-              </w:rPr>
-              <w:t xml:space="preserve">
-              </w:t>
-            </w:r>
-            <w:r>
-              <w:rPr>
-                <w:sz w:val="20"/>
-                <w:szCs w:val="20"/>
-                <w:lang w:val="en-GB"/>
-              </w:rPr>
-              <w:t>
-              </w:t>
-            </w:r>
-            <w:r>
-              <w:rPr>
-                <w:sz w:val="20"/>
-                <w:szCs w:val="20"/>
-                <w:lang w:val="en-GB"/>
-              </w:rPr>
-              <w:t xml:space="preserve">
-              </w:t>
-            </w:r>
-            <w:r>
-              <w:rPr>
-                <w:sz w:val="20"/>
-                <w:szCs w:val="20"/>
-                <w:lang w:val="en-GB"/>
-              </w:rPr>
-              <w:t>
-              </w:t>
-            </w:r>
-            <w:r>
-              <w:rPr>
-                <w:sz w:val="20"/>
-                <w:szCs w:val="20"/>
-                <w:lang w:val="en-GB"/>
-              </w:rPr>
-              <w:t xml:space="preserve">
-              </w:t>
-            </w:r>
-            <w:r>
-              <w:rPr>
-                <w:sz w:val="20"/>
-                <w:szCs w:val="20"/>
-                <w:lang w:val="en-GB"/>
-              </w:rPr>
-              <w:t xml:space="preserve">
-              </w:t>
+              <w:t xml:space="preserve">               </w:t>
             </w:r>
           </w:p>
         </w:tc>
@@ -4176,17 +3745,7 @@
                 <w:szCs w:val="20"/>
                 <w:lang w:val="en-GB"/>
               </w:rPr>
-              <w:t xml:space="preserve">
-              </w:t>
-            </w:r>
-            <w:r>
-              <w:rPr>
-                <w:sz w:val="20"/>
-                <w:szCs w:val="20"/>
-                <w:lang w:val="en-GB"/>
-              </w:rPr>
-              <w:t>
-              </w:t>
+              <w:t xml:space="preserve">               </w:t>
             </w:r>
           </w:p>
         </w:tc>
@@ -4805,36 +4364,7 @@
           <w:szCs w:val="20"/>
           <w:lang w:val="en-GB"/>
         </w:rPr>
-        <w:t xml:space="preserve">Wooldridge J.M. Introductory econometrics. A modern approach. Joshua D. Angrist, Jorn-Steffen Pischke. Mostly Harmless Econometrics. An Empiricist's Companion.</w:t>
-      </w:r>
-      <w:r>
-        <w:rPr>
-          <w:i/>
-          <w:iCs/>
-          <w:sz w:val="20"/>
-          <w:szCs w:val="20"/>
-          <w:lang w:val="en-GB"/>
-        </w:rPr>
-        <w:t>
-        </w:t>
-      </w:r>
-      <w:r>
-        <w:rPr>
-          <w:sz w:val="20"/>
-          <w:szCs w:val="20"/>
-          <w:lang w:val="en-GB"/>
-        </w:rPr>
-        <w:t>
-        </w:t>
-      </w:r>
-      <w:r>
-        <w:rPr>
-          <w:sz w:val="20"/>
-          <w:szCs w:val="20"/>
-          <w:lang w:val="en-GB"/>
-        </w:rPr>
-        <w:t xml:space="preserve">
-        </w:t>
+        <w:t xml:space="preserve">Wooldridge J.M. Introductory econometrics. A modern approach. Joshua D. Angrist, Jorn-Steffen Pischke. Mostly Harmless Econometrics. An Empiricist's Companion.         </w:t>
       </w:r>
       <w:r>
         <w:rPr>
@@ -4843,37 +4373,7 @@
           <w:lang w:val="en-GB"/>
         </w:rPr>
         <w:br/>
-        <w:t xml:space="preserve">
-        </w:t>
-      </w:r>
-      <w:r>
-        <w:rPr>
-          <w:i/>
-          <w:iCs/>
-          <w:sz w:val="20"/>
-          <w:szCs w:val="20"/>
-          <w:lang w:val="en-GB"/>
-        </w:rPr>
-        <w:t>
-        </w:t>
-      </w:r>
-      <w:r>
-        <w:rPr>
-          <w:sz w:val="20"/>
-          <w:szCs w:val="20"/>
-          <w:lang w:val="en-GB"/>
-        </w:rPr>
-        <w:t>
-        </w:t>
-      </w:r>
-      <w:r>
-        <w:rPr>
-          <w:sz w:val="20"/>
-          <w:szCs w:val="20"/>
-          <w:lang w:val="en-GB"/>
-        </w:rPr>
-        <w:t xml:space="preserve">
-        </w:t>
+        <w:t xml:space="preserve">                  </w:t>
       </w:r>
     </w:p>
     <w:p>
@@ -4896,56 +4396,7 @@
           <w:szCs w:val="20"/>
           <w:lang w:val="en-GB"/>
         </w:rPr>
-        <w:t>John W. Creswell. Qualitative Inquiry and Research Design. Choosing Among Five Approaches.</w:t>
-      </w:r>
-      <w:r>
-        <w:rPr>
-          <w:sz w:val="20"/>
-          <w:szCs w:val="20"/>
-          <w:lang w:val="en-GB"/>
-        </w:rPr>
-        <w:t>
-        </w:t>
-      </w:r>
-      <w:r>
-        <w:rPr>
-          <w:sz w:val="20"/>
-          <w:szCs w:val="20"/>
-          <w:lang w:val="en-GB"/>
-        </w:rPr>
-        <w:t xml:space="preserve">
-        </w:t>
-      </w:r>
-      <w:r>
-        <w:rPr>
-          <w:i/>
-          <w:iCs/>
-          <w:sz w:val="20"/>
-          <w:szCs w:val="20"/>
-          <w:lang w:val="en-GB"/>
-        </w:rPr>
-        <w:t>
-        </w:t>
-      </w:r>
-      <w:r>
-        <w:rPr>
-          <w:i/>
-          <w:iCs/>
-          <w:sz w:val="20"/>
-          <w:szCs w:val="20"/>
-          <w:lang w:val="en-GB"/>
-        </w:rPr>
-        <w:t>
-        </w:t>
-      </w:r>
-      <w:r>
-        <w:rPr>
-          <w:sz w:val="20"/>
-          <w:szCs w:val="20"/>
-          <w:lang w:val="en-GB"/>
-        </w:rPr>
-        <w:t xml:space="preserve">
-        </w:t>
+        <w:t xml:space="preserve">John W. Creswell. Qualitative Inquiry and Research Design. Choosing Among Five Approaches.                  </w:t>
       </w:r>
     </w:p>
     <w:p>
@@ -5396,12 +4847,8 @@
       </w:pPr>
     </w:p>
     <w:sectPr>
-      <w:headerReference w:type="even" r:id="rId11"/>
-      <w:headerReference w:type="default" r:id="rId12"/>
-      <w:footerReference w:type="even" r:id="rId13"/>
-      <w:footerReference w:type="default" r:id="rId14"/>
-      <w:headerReference w:type="first" r:id="rId15"/>
-      <w:footerReference w:type="first" r:id="rId16"/>
+      <w:headerReference w:type="default" r:id="rId11"/>
+      <w:footerReference w:type="default" r:id="rId12"/>
       <w:pgSz w:w="11906" w:h="16838"/>
       <w:pgMar w:top="1985" w:right="1276" w:bottom="170" w:left="1276" w:header="851" w:footer="397" w:gutter="0"/>
       <w:cols w:space="708"/>
@@ -5440,16 +4887,6 @@
 <w:ftr xmlns:wpc="http://schemas.microsoft.com/office/word/2010/wordprocessingCanvas" xmlns:cx="http://schemas.microsoft.com/office/drawing/2014/chartex" xmlns:cx1="http://schemas.microsoft.com/office/drawing/2015/9/8/chartex" xmlns:cx2="http://schemas.microsoft.com/office/drawing/2015/10/21/chartex" xmlns:cx3="http://schemas.microsoft.com/office/drawing/2016/5/9/chartex" xmlns:cx4="http://schemas.microsoft.com/office/drawing/2016/5/10/chartex" xmlns:cx5="http://schemas.microsoft.com/office/drawing/2016/5/11/chartex" xmlns:cx6="http://schemas.microsoft.com/office/drawing/2016/5/12/chartex" xmlns:cx7="http://schemas.microsoft.com/office/drawing/2016/5/13/chartex" xmlns:cx8="http://schemas.microsoft.com/office/drawing/2016/5/14/chartex" xmlns:mc="http://schemas.openxmlformats.org/markup-compatibility/2006" xmlns:aink="http://schemas.microsoft.com/office/drawing/2016/ink" xmlns:am3d="http://schemas.microsoft.com/office/drawing/2017/model3d" xmlns:o="urn:schemas-microsoft-com:office:office" xmlns:oel="http://schemas.microsoft.com/office/2019/extlst" xmlns:r="http://schemas.openxmlformats.org/officeDocument/2006/relationships" xmlns:m="http://schemas.openxmlformats.org/officeDocument/2006/math" xmlns:v="urn:schemas-microsoft-com:vml" xmlns:wp14="http://schemas.microsoft.com/office/word/2010/wordprocessingDrawing" xmlns:wp="http://schemas.openxmlformats.org/drawingml/2006/wordprocessingDrawing" xmlns:w10="urn:schemas-microsoft-com:office:word" xmlns:w="http://schemas.openxmlformats.org/wordprocessingml/2006/main" xmlns:w14="http://schemas.microsoft.com/office/word/2010/wordml" xmlns:w15="http://schemas.microsoft.com/office/word/2012/wordml" xmlns:w16cex="http://schemas.microsoft.com/office/word/2018/wordml/cex" xmlns:w16cid="http://schemas.microsoft.com/office/word/2016/wordml/cid" xmlns:w16="http://schemas.microsoft.com/office/word/2018/wordml" xmlns:w16du="http://schemas.microsoft.com/office/word/2023/wordml/word16du" xmlns:w16sdtdh="http://schemas.microsoft.com/office/word/2020/wordml/sdtdatahash" xmlns:w16sdtfl="http://schemas.microsoft.com/office/word/2024/wordml/sdtformatlock" xmlns:w16se="http://schemas.microsoft.com/office/word/2015/wordml/symex" xmlns:wpg="http://schemas.microsoft.com/office/word/2010/wordprocessingGroup" xmlns:wpi="http://schemas.microsoft.com/office/word/2010/wordprocessingInk" xmlns:wne="http://schemas.microsoft.com/office/word/2006/wordml" xmlns:wps="http://schemas.microsoft.com/office/word/2010/wordprocessingShape" mc:Ignorable="w14 w15 w16se w16cid w16 w16cex w16sdtdh w16sdtfl w16du wp14">
   <w:p>
     <w:pPr>
-      <w:pStyle w:val="Footer"/>
-    </w:pPr>
-  </w:p>
-</w:ftr>
-</file>
-
-<file path=word/footer2.xml><?xml version="1.0" encoding="utf-8"?>
-<w:ftr xmlns:wpc="http://schemas.microsoft.com/office/word/2010/wordprocessingCanvas" xmlns:cx="http://schemas.microsoft.com/office/drawing/2014/chartex" xmlns:cx1="http://schemas.microsoft.com/office/drawing/2015/9/8/chartex" xmlns:cx2="http://schemas.microsoft.com/office/drawing/2015/10/21/chartex" xmlns:cx3="http://schemas.microsoft.com/office/drawing/2016/5/9/chartex" xmlns:cx4="http://schemas.microsoft.com/office/drawing/2016/5/10/chartex" xmlns:cx5="http://schemas.microsoft.com/office/drawing/2016/5/11/chartex" xmlns:cx6="http://schemas.microsoft.com/office/drawing/2016/5/12/chartex" xmlns:cx7="http://schemas.microsoft.com/office/drawing/2016/5/13/chartex" xmlns:cx8="http://schemas.microsoft.com/office/drawing/2016/5/14/chartex" xmlns:mc="http://schemas.openxmlformats.org/markup-compatibility/2006" xmlns:aink="http://schemas.microsoft.com/office/drawing/2016/ink" xmlns:am3d="http://schemas.microsoft.com/office/drawing/2017/model3d" xmlns:o="urn:schemas-microsoft-com:office:office" xmlns:oel="http://schemas.microsoft.com/office/2019/extlst" xmlns:r="http://schemas.openxmlformats.org/officeDocument/2006/relationships" xmlns:m="http://schemas.openxmlformats.org/officeDocument/2006/math" xmlns:v="urn:schemas-microsoft-com:vml" xmlns:wp14="http://schemas.microsoft.com/office/word/2010/wordprocessingDrawing" xmlns:wp="http://schemas.openxmlformats.org/drawingml/2006/wordprocessingDrawing" xmlns:w10="urn:schemas-microsoft-com:office:word" xmlns:w="http://schemas.openxmlformats.org/wordprocessingml/2006/main" xmlns:w14="http://schemas.microsoft.com/office/word/2010/wordml" xmlns:w15="http://schemas.microsoft.com/office/word/2012/wordml" xmlns:w16cex="http://schemas.microsoft.com/office/word/2018/wordml/cex" xmlns:w16cid="http://schemas.microsoft.com/office/word/2016/wordml/cid" xmlns:w16="http://schemas.microsoft.com/office/word/2018/wordml" xmlns:w16du="http://schemas.microsoft.com/office/word/2023/wordml/word16du" xmlns:w16sdtdh="http://schemas.microsoft.com/office/word/2020/wordml/sdtdatahash" xmlns:w16sdtfl="http://schemas.microsoft.com/office/word/2024/wordml/sdtformatlock" xmlns:w16se="http://schemas.microsoft.com/office/word/2015/wordml/symex" xmlns:wpg="http://schemas.microsoft.com/office/word/2010/wordprocessingGroup" xmlns:wpi="http://schemas.microsoft.com/office/word/2010/wordprocessingInk" xmlns:wne="http://schemas.microsoft.com/office/word/2006/wordml" xmlns:wps="http://schemas.microsoft.com/office/word/2010/wordprocessingShape" mc:Ignorable="w14 w15 w16se w16cid w16 w16cex w16sdtdh w16sdtfl w16du wp14">
-  <w:p>
-    <w:pPr>
       <w:pStyle w:val="Prrafobsico"/>
       <w:tabs>
         <w:tab w:val="right" w:pos="9354"/>
@@ -5647,16 +5084,6 @@
 </w:ftr>
 </file>
 
-<file path=word/footer3.xml><?xml version="1.0" encoding="utf-8"?>
-<w:ftr xmlns:wpc="http://schemas.microsoft.com/office/word/2010/wordprocessingCanvas" xmlns:cx="http://schemas.microsoft.com/office/drawing/2014/chartex" xmlns:cx1="http://schemas.microsoft.com/office/drawing/2015/9/8/chartex" xmlns:cx2="http://schemas.microsoft.com/office/drawing/2015/10/21/chartex" xmlns:cx3="http://schemas.microsoft.com/office/drawing/2016/5/9/chartex" xmlns:cx4="http://schemas.microsoft.com/office/drawing/2016/5/10/chartex" xmlns:cx5="http://schemas.microsoft.com/office/drawing/2016/5/11/chartex" xmlns:cx6="http://schemas.microsoft.com/office/drawing/2016/5/12/chartex" xmlns:cx7="http://schemas.microsoft.com/office/drawing/2016/5/13/chartex" xmlns:cx8="http://schemas.microsoft.com/office/drawing/2016/5/14/chartex" xmlns:mc="http://schemas.openxmlformats.org/markup-compatibility/2006" xmlns:aink="http://schemas.microsoft.com/office/drawing/2016/ink" xmlns:am3d="http://schemas.microsoft.com/office/drawing/2017/model3d" xmlns:o="urn:schemas-microsoft-com:office:office" xmlns:oel="http://schemas.microsoft.com/office/2019/extlst" xmlns:r="http://schemas.openxmlformats.org/officeDocument/2006/relationships" xmlns:m="http://schemas.openxmlformats.org/officeDocument/2006/math" xmlns:v="urn:schemas-microsoft-com:vml" xmlns:wp14="http://schemas.microsoft.com/office/word/2010/wordprocessingDrawing" xmlns:wp="http://schemas.openxmlformats.org/drawingml/2006/wordprocessingDrawing" xmlns:w10="urn:schemas-microsoft-com:office:word" xmlns:w="http://schemas.openxmlformats.org/wordprocessingml/2006/main" xmlns:w14="http://schemas.microsoft.com/office/word/2010/wordml" xmlns:w15="http://schemas.microsoft.com/office/word/2012/wordml" xmlns:w16cex="http://schemas.microsoft.com/office/word/2018/wordml/cex" xmlns:w16cid="http://schemas.microsoft.com/office/word/2016/wordml/cid" xmlns:w16="http://schemas.microsoft.com/office/word/2018/wordml" xmlns:w16du="http://schemas.microsoft.com/office/word/2023/wordml/word16du" xmlns:w16sdtdh="http://schemas.microsoft.com/office/word/2020/wordml/sdtdatahash" xmlns:w16sdtfl="http://schemas.microsoft.com/office/word/2024/wordml/sdtformatlock" xmlns:w16se="http://schemas.microsoft.com/office/word/2015/wordml/symex" xmlns:wpg="http://schemas.microsoft.com/office/word/2010/wordprocessingGroup" xmlns:wpi="http://schemas.microsoft.com/office/word/2010/wordprocessingInk" xmlns:wne="http://schemas.microsoft.com/office/word/2006/wordml" xmlns:wps="http://schemas.microsoft.com/office/word/2010/wordprocessingShape" mc:Ignorable="w14 w15 w16se w16cid w16 w16cex w16sdtdh w16sdtfl w16du wp14">
-  <w:p>
-    <w:pPr>
-      <w:pStyle w:val="Footer"/>
-    </w:pPr>
-  </w:p>
-</w:ftr>
-</file>
-
 <file path=word/footnotes.xml><?xml version="1.0" encoding="utf-8"?>
 <w:footnotes xmlns:wpc="http://schemas.microsoft.com/office/word/2010/wordprocessingCanvas" xmlns:cx="http://schemas.microsoft.com/office/drawing/2014/chartex" xmlns:cx1="http://schemas.microsoft.com/office/drawing/2015/9/8/chartex" xmlns:cx2="http://schemas.microsoft.com/office/drawing/2015/10/21/chartex" xmlns:cx3="http://schemas.microsoft.com/office/drawing/2016/5/9/chartex" xmlns:cx4="http://schemas.microsoft.com/office/drawing/2016/5/10/chartex" xmlns:cx5="http://schemas.microsoft.com/office/drawing/2016/5/11/chartex" xmlns:cx6="http://schemas.microsoft.com/office/drawing/2016/5/12/chartex" xmlns:cx7="http://schemas.microsoft.com/office/drawing/2016/5/13/chartex" xmlns:cx8="http://schemas.microsoft.com/office/drawing/2016/5/14/chartex" xmlns:mc="http://schemas.openxmlformats.org/markup-compatibility/2006" xmlns:aink="http://schemas.microsoft.com/office/drawing/2016/ink" xmlns:am3d="http://schemas.microsoft.com/office/drawing/2017/model3d" xmlns:o="urn:schemas-microsoft-com:office:office" xmlns:oel="http://schemas.microsoft.com/office/2019/extlst" xmlns:r="http://schemas.openxmlformats.org/officeDocument/2006/relationships" xmlns:m="http://schemas.openxmlformats.org/officeDocument/2006/math" xmlns:v="urn:schemas-microsoft-com:vml" xmlns:wp14="http://schemas.microsoft.com/office/word/2010/wordprocessingDrawing" xmlns:wp="http://schemas.openxmlformats.org/drawingml/2006/wordprocessingDrawing" xmlns:w10="urn:schemas-microsoft-com:office:word" xmlns:w="http://schemas.openxmlformats.org/wordprocessingml/2006/main" xmlns:w14="http://schemas.microsoft.com/office/word/2010/wordml" xmlns:w15="http://schemas.microsoft.com/office/word/2012/wordml" xmlns:w16cex="http://schemas.microsoft.com/office/word/2018/wordml/cex" xmlns:w16cid="http://schemas.microsoft.com/office/word/2016/wordml/cid" xmlns:w16="http://schemas.microsoft.com/office/word/2018/wordml" xmlns:w16du="http://schemas.microsoft.com/office/word/2023/wordml/word16du" xmlns:w16sdtdh="http://schemas.microsoft.com/office/word/2020/wordml/sdtdatahash" xmlns:w16sdtfl="http://schemas.microsoft.com/office/word/2024/wordml/sdtformatlock" xmlns:w16se="http://schemas.microsoft.com/office/word/2015/wordml/symex" xmlns:wpg="http://schemas.microsoft.com/office/word/2010/wordprocessingGroup" xmlns:wpi="http://schemas.microsoft.com/office/word/2010/wordprocessingInk" xmlns:wne="http://schemas.microsoft.com/office/word/2006/wordml" xmlns:wps="http://schemas.microsoft.com/office/word/2010/wordprocessingShape" mc:Ignorable="w14 w15 w16se w16cid w16 w16cex w16sdtdh w16sdtfl w16du wp14">
   <w:footnote w:type="separator" w:id="-1">
@@ -5683,16 +5110,6 @@
 </file>
 
 <file path=word/header1.xml><?xml version="1.0" encoding="utf-8"?>
-<w:hdr xmlns:wpc="http://schemas.microsoft.com/office/word/2010/wordprocessingCanvas" xmlns:cx="http://schemas.microsoft.com/office/drawing/2014/chartex" xmlns:cx1="http://schemas.microsoft.com/office/drawing/2015/9/8/chartex" xmlns:cx2="http://schemas.microsoft.com/office/drawing/2015/10/21/chartex" xmlns:cx3="http://schemas.microsoft.com/office/drawing/2016/5/9/chartex" xmlns:cx4="http://schemas.microsoft.com/office/drawing/2016/5/10/chartex" xmlns:cx5="http://schemas.microsoft.com/office/drawing/2016/5/11/chartex" xmlns:cx6="http://schemas.microsoft.com/office/drawing/2016/5/12/chartex" xmlns:cx7="http://schemas.microsoft.com/office/drawing/2016/5/13/chartex" xmlns:cx8="http://schemas.microsoft.com/office/drawing/2016/5/14/chartex" xmlns:mc="http://schemas.openxmlformats.org/markup-compatibility/2006" xmlns:aink="http://schemas.microsoft.com/office/drawing/2016/ink" xmlns:am3d="http://schemas.microsoft.com/office/drawing/2017/model3d" xmlns:o="urn:schemas-microsoft-com:office:office" xmlns:oel="http://schemas.microsoft.com/office/2019/extlst" xmlns:r="http://schemas.openxmlformats.org/officeDocument/2006/relationships" xmlns:m="http://schemas.openxmlformats.org/officeDocument/2006/math" xmlns:v="urn:schemas-microsoft-com:vml" xmlns:wp14="http://schemas.microsoft.com/office/word/2010/wordprocessingDrawing" xmlns:wp="http://schemas.openxmlformats.org/drawingml/2006/wordprocessingDrawing" xmlns:w10="urn:schemas-microsoft-com:office:word" xmlns:w="http://schemas.openxmlformats.org/wordprocessingml/2006/main" xmlns:w14="http://schemas.microsoft.com/office/word/2010/wordml" xmlns:w15="http://schemas.microsoft.com/office/word/2012/wordml" xmlns:w16cex="http://schemas.microsoft.com/office/word/2018/wordml/cex" xmlns:w16cid="http://schemas.microsoft.com/office/word/2016/wordml/cid" xmlns:w16="http://schemas.microsoft.com/office/word/2018/wordml" xmlns:w16du="http://schemas.microsoft.com/office/word/2023/wordml/word16du" xmlns:w16sdtdh="http://schemas.microsoft.com/office/word/2020/wordml/sdtdatahash" xmlns:w16sdtfl="http://schemas.microsoft.com/office/word/2024/wordml/sdtformatlock" xmlns:w16se="http://schemas.microsoft.com/office/word/2015/wordml/symex" xmlns:wpg="http://schemas.microsoft.com/office/word/2010/wordprocessingGroup" xmlns:wpi="http://schemas.microsoft.com/office/word/2010/wordprocessingInk" xmlns:wne="http://schemas.microsoft.com/office/word/2006/wordml" xmlns:wps="http://schemas.microsoft.com/office/word/2010/wordprocessingShape" mc:Ignorable="w14 w15 w16se w16cid w16 w16cex w16sdtdh w16sdtfl w16du wp14">
-  <w:p>
-    <w:pPr>
-      <w:pStyle w:val="Header"/>
-    </w:pPr>
-  </w:p>
-</w:hdr>
-</file>
-
-<file path=word/header2.xml><?xml version="1.0" encoding="utf-8"?>
 <w:hdr xmlns:wpc="http://schemas.microsoft.com/office/word/2010/wordprocessingCanvas" xmlns:cx="http://schemas.microsoft.com/office/drawing/2014/chartex" xmlns:cx1="http://schemas.microsoft.com/office/drawing/2015/9/8/chartex" xmlns:cx2="http://schemas.microsoft.com/office/drawing/2015/10/21/chartex" xmlns:cx3="http://schemas.microsoft.com/office/drawing/2016/5/9/chartex" xmlns:cx4="http://schemas.microsoft.com/office/drawing/2016/5/10/chartex" xmlns:cx5="http://schemas.microsoft.com/office/drawing/2016/5/11/chartex" xmlns:cx6="http://schemas.microsoft.com/office/drawing/2016/5/12/chartex" xmlns:cx7="http://schemas.microsoft.com/office/drawing/2016/5/13/chartex" xmlns:cx8="http://schemas.microsoft.com/office/drawing/2016/5/14/chartex" xmlns:mc="http://schemas.openxmlformats.org/markup-compatibility/2006" xmlns:aink="http://schemas.microsoft.com/office/drawing/2016/ink" xmlns:am3d="http://schemas.microsoft.com/office/drawing/2017/model3d" xmlns:o="urn:schemas-microsoft-com:office:office" xmlns:oel="http://schemas.microsoft.com/office/2019/extlst" xmlns:r="http://schemas.openxmlformats.org/officeDocument/2006/relationships" xmlns:m="http://schemas.openxmlformats.org/officeDocument/2006/math" xmlns:v="urn:schemas-microsoft-com:vml" xmlns:wp14="http://schemas.microsoft.com/office/word/2010/wordprocessingDrawing" xmlns:wp="http://schemas.openxmlformats.org/drawingml/2006/wordprocessingDrawing" xmlns:w10="urn:schemas-microsoft-com:office:word" xmlns:w="http://schemas.openxmlformats.org/wordprocessingml/2006/main" xmlns:w14="http://schemas.microsoft.com/office/word/2010/wordml" xmlns:w15="http://schemas.microsoft.com/office/word/2012/wordml" xmlns:w16cex="http://schemas.microsoft.com/office/word/2018/wordml/cex" xmlns:w16cid="http://schemas.microsoft.com/office/word/2016/wordml/cid" xmlns:w16="http://schemas.microsoft.com/office/word/2018/wordml" xmlns:w16du="http://schemas.microsoft.com/office/word/2023/wordml/word16du" xmlns:w16sdtdh="http://schemas.microsoft.com/office/word/2020/wordml/sdtdatahash" xmlns:w16sdtfl="http://schemas.microsoft.com/office/word/2024/wordml/sdtformatlock" xmlns:w16se="http://schemas.microsoft.com/office/word/2015/wordml/symex" xmlns:wpg="http://schemas.microsoft.com/office/word/2010/wordprocessingGroup" xmlns:wpi="http://schemas.microsoft.com/office/word/2010/wordprocessingInk" xmlns:wne="http://schemas.microsoft.com/office/word/2006/wordml" xmlns:wps="http://schemas.microsoft.com/office/word/2010/wordprocessingShape" mc:Ignorable="w14 w15 w16se w16cid w16 w16cex w16sdtdh w16sdtfl w16du wp14">
   <w:p>
     <w:pPr>
@@ -5971,7 +5388,7 @@
         <w:sz w:val="28"/>
         <w:szCs w:val="28"/>
       </w:rPr>
-      <w:t>5</w:t>
+      <w:t>6</w:t>
     </w:r>
     <w:r>
       <w:rPr>
@@ -5993,7 +5410,7 @@
         <w:sz w:val="28"/>
         <w:szCs w:val="28"/>
       </w:rPr>
-      <w:t>6</w:t>
+      <w:t>7</w:t>
     </w:r>
   </w:p>
   <w:p>
@@ -6035,16 +5452,6 @@
       </w:rPr>
       <w:tab/>
     </w:r>
-  </w:p>
-</w:hdr>
-</file>
-
-<file path=word/header3.xml><?xml version="1.0" encoding="utf-8"?>
-<w:hdr xmlns:wpc="http://schemas.microsoft.com/office/word/2010/wordprocessingCanvas" xmlns:cx="http://schemas.microsoft.com/office/drawing/2014/chartex" xmlns:cx1="http://schemas.microsoft.com/office/drawing/2015/9/8/chartex" xmlns:cx2="http://schemas.microsoft.com/office/drawing/2015/10/21/chartex" xmlns:cx3="http://schemas.microsoft.com/office/drawing/2016/5/9/chartex" xmlns:cx4="http://schemas.microsoft.com/office/drawing/2016/5/10/chartex" xmlns:cx5="http://schemas.microsoft.com/office/drawing/2016/5/11/chartex" xmlns:cx6="http://schemas.microsoft.com/office/drawing/2016/5/12/chartex" xmlns:cx7="http://schemas.microsoft.com/office/drawing/2016/5/13/chartex" xmlns:cx8="http://schemas.microsoft.com/office/drawing/2016/5/14/chartex" xmlns:mc="http://schemas.openxmlformats.org/markup-compatibility/2006" xmlns:aink="http://schemas.microsoft.com/office/drawing/2016/ink" xmlns:am3d="http://schemas.microsoft.com/office/drawing/2017/model3d" xmlns:o="urn:schemas-microsoft-com:office:office" xmlns:oel="http://schemas.microsoft.com/office/2019/extlst" xmlns:r="http://schemas.openxmlformats.org/officeDocument/2006/relationships" xmlns:m="http://schemas.openxmlformats.org/officeDocument/2006/math" xmlns:v="urn:schemas-microsoft-com:vml" xmlns:wp14="http://schemas.microsoft.com/office/word/2010/wordprocessingDrawing" xmlns:wp="http://schemas.openxmlformats.org/drawingml/2006/wordprocessingDrawing" xmlns:w10="urn:schemas-microsoft-com:office:word" xmlns:w="http://schemas.openxmlformats.org/wordprocessingml/2006/main" xmlns:w14="http://schemas.microsoft.com/office/word/2010/wordml" xmlns:w15="http://schemas.microsoft.com/office/word/2012/wordml" xmlns:w16cex="http://schemas.microsoft.com/office/word/2018/wordml/cex" xmlns:w16cid="http://schemas.microsoft.com/office/word/2016/wordml/cid" xmlns:w16="http://schemas.microsoft.com/office/word/2018/wordml" xmlns:w16du="http://schemas.microsoft.com/office/word/2023/wordml/word16du" xmlns:w16sdtdh="http://schemas.microsoft.com/office/word/2020/wordml/sdtdatahash" xmlns:w16sdtfl="http://schemas.microsoft.com/office/word/2024/wordml/sdtformatlock" xmlns:w16se="http://schemas.microsoft.com/office/word/2015/wordml/symex" xmlns:wpg="http://schemas.microsoft.com/office/word/2010/wordprocessingGroup" xmlns:wpi="http://schemas.microsoft.com/office/word/2010/wordprocessingInk" xmlns:wne="http://schemas.microsoft.com/office/word/2006/wordml" xmlns:wps="http://schemas.microsoft.com/office/word/2010/wordprocessingShape" mc:Ignorable="w14 w15 w16se w16cid w16 w16cex w16sdtdh w16sdtfl w16du wp14">
-  <w:p>
-    <w:pPr>
-      <w:pStyle w:val="Header"/>
-    </w:pPr>
   </w:p>
 </w:hdr>
 </file>
@@ -9546,7 +8953,12 @@
 </file>
 
 <file path=customXml/item1.xml><?xml version="1.0" encoding="utf-8"?>
-<b:Sources xmlns:b="http://schemas.openxmlformats.org/officeDocument/2006/bibliography" xmlns="http://schemas.openxmlformats.org/officeDocument/2006/bibliography" SelectedStyle="\APASixthEditionOfficeOnline.xsl" StyleName="APA" Version="6"/>
+<?mso-contentType ?>
+<FormTemplates xmlns="http://schemas.microsoft.com/sharepoint/v3/contenttype/forms">
+  <Display>DocumentLibraryForm</Display>
+  <Edit>DocumentLibraryForm</Edit>
+  <New>DocumentLibraryForm</New>
+</FormTemplates>
 </file>
 
 <file path=customXml/item2.xml><?xml version="1.0" encoding="utf-8"?>
@@ -9773,18 +9185,13 @@
 </file>
 
 <file path=customXml/item3.xml><?xml version="1.0" encoding="utf-8"?>
-<?mso-contentType ?>
-<FormTemplates xmlns="http://schemas.microsoft.com/sharepoint/v3/contenttype/forms">
-  <Display>DocumentLibraryForm</Display>
-  <Edit>DocumentLibraryForm</Edit>
-  <New>DocumentLibraryForm</New>
-</FormTemplates>
+<b:Sources xmlns:b="http://schemas.openxmlformats.org/officeDocument/2006/bibliography" xmlns="http://schemas.openxmlformats.org/officeDocument/2006/bibliography" SelectedStyle="\APASixthEditionOfficeOnline.xsl" StyleName="APA" Version="6"/>
 </file>
 
 <file path=customXml/itemProps1.xml><?xml version="1.0" encoding="utf-8"?>
-<ds:datastoreItem xmlns:ds="http://schemas.openxmlformats.org/officeDocument/2006/customXml" ds:itemID="{D22F0133-C144-42F7-B3F6-C2A1492A69C5}">
+<ds:datastoreItem xmlns:ds="http://schemas.openxmlformats.org/officeDocument/2006/customXml" ds:itemID="{BE56040F-5A4D-453F-A494-00ECCD7C3386}">
   <ds:schemaRefs>
-    <ds:schemaRef ds:uri="http://schemas.openxmlformats.org/officeDocument/2006/bibliography"/>
+    <ds:schemaRef ds:uri="http://schemas.microsoft.com/sharepoint/v3/contenttype/forms"/>
   </ds:schemaRefs>
 </ds:datastoreItem>
 </file>
@@ -9809,9 +9216,9 @@
 </file>
 
 <file path=customXml/itemProps3.xml><?xml version="1.0" encoding="utf-8"?>
-<ds:datastoreItem xmlns:ds="http://schemas.openxmlformats.org/officeDocument/2006/customXml" ds:itemID="{BE56040F-5A4D-453F-A494-00ECCD7C3386}">
+<ds:datastoreItem xmlns:ds="http://schemas.openxmlformats.org/officeDocument/2006/customXml" ds:itemID="{D22F0133-C144-42F7-B3F6-C2A1492A69C5}">
   <ds:schemaRefs>
-    <ds:schemaRef ds:uri="http://schemas.microsoft.com/sharepoint/v3/contenttype/forms"/>
+    <ds:schemaRef ds:uri="http://schemas.openxmlformats.org/officeDocument/2006/bibliography"/>
   </ds:schemaRefs>
 </ds:datastoreItem>
 </file>
</xml_diff>